<commit_message>
Assign site ISBN 979-8-90690-531-4 to Chen Chunni volume 531
The published mathematics monograph lacked an ISBN. Allocate the unused 531 slot in the site's existing 979-8-90690 range, after checking all 516 catalogue entries and 106 reservation records. Retain volume 531 and its existing URLs.

Synchronize the reservation, catalogue, three shelf cards, reader, learning companion, portable knowledge kit, and the Word/PDF front matter. Keep the online-edition status and record external registry verification separately.

Validation: ISBN checksum valid; 515 other catalogue entries and shelf cards preserved; 25 learning tasks and 33 source sections unchanged; PDFs remain 324 and 45 pages, with only the ISBN pages changed; JavaScript syntax and all asset and kit checksums verified. No manual search reindex.
</commit_message>
<xml_diff>
--- a/public/books/m/531/learning-pack.docx
+++ b/public/books/m/531/learning-pack.docx
@@ -72,6 +72,14 @@
           <w:t>阅读、学习与知返智能体统一入口</w:t>
         </w:r>
       </w:hyperlink>
+    </w:p>
+    <w:p>
+      <w:pPr>
+        <w:pStyle w:val="Small"/>
+      </w:pPr>
+      <w:r>
+        <w:t xml:space="preserve">配套主书 ISBN  979-8-90690-531-4</w:t>
+      </w:r>
     </w:p>
     <w:p>
       <w:pPr>

</xml_diff>